<commit_message>
Add portfolio link to downloadable resume
</commit_message>
<xml_diff>
--- a/Andrew-Molnar-Resume.docx
+++ b/Andrew-Molnar-Resume.docx
@@ -94,6 +94,28 @@
             <w:szCs w:val="24"/>
           </w:rPr>
           <w:t>grumblyandy@yahoo.com</w:t>
+        </w:r>
+      </w:hyperlink>
+      <w:r>
+        <w:rPr>
+          <w:rFonts w:cstheme="minorHAnsi"/>
+          <w:b/>
+          <w:bCs/>
+          <w:sz w:val="24"/>
+          <w:szCs w:val="24"/>
+        </w:rPr>
+        <w:t xml:space="preserve"> • </w:t>
+      </w:r>
+      <w:hyperlink r:id="rId10" w:history="1">
+        <w:r>
+          <w:rPr>
+            <w:rStyle w:val="Hyperlink"/>
+            <w:b/>
+            <w:bCs/>
+            <w:sz w:val="24"/>
+            <w:szCs w:val="24"/>
+          </w:rPr>
+          <w:t>amolnar68.github.io</w:t>
         </w:r>
       </w:hyperlink>
     </w:p>

</xml_diff>